<commit_message>
feat(word-generator): generate demand letter from template
</commit_message>
<xml_diff>
--- a/src/main/resources/templates/demandtemplate.docx
+++ b/src/main/resources/templates/demandtemplate.docx
@@ -76,7 +76,22 @@
         <w:jc w:val="right"/>
       </w:pPr>
       <w:r>
-        <w:t>${MONTH YEAR}</w:t>
+        <w:t>${</w:t>
+      </w:r>
+      <w:r>
+        <w:t>CUR</w:t>
+      </w:r>
+      <w:r>
+        <w:t>_</w:t>
+      </w:r>
+      <w:r>
+        <w:t>MONTH</w:t>
+      </w:r>
+      <w:r>
+        <w:t>_</w:t>
+      </w:r>
+      <w:r>
+        <w:t>YEAR}</w:t>
       </w:r>
     </w:p>
     <w:p>
@@ -173,7 +188,7 @@
           </mc:Choice>
           <mc:Fallback>
             <w:pict>
-              <v:line w14:anchorId="1AE06C05" id="Straight Connector 2" o:spid="_x0000_s1026" alt="Straight Connector 1260553175" style="position:absolute;z-index:251659264;visibility:visible;mso-wrap-style:square;mso-width-percent:0;mso-height-percent:0;mso-wrap-distance-left:0;mso-wrap-distance-top:-3e-5mm;mso-wrap-distance-right:0;mso-wrap-distance-bottom:-3e-5mm;mso-position-horizontal:center;mso-position-horizontal-relative:margin;mso-position-vertical:absolute;mso-position-vertical-relative:line;mso-width-percent:0;mso-height-percent:0;mso-width-relative:page;mso-height-relative:page" from="0,5.55pt" to="106.5pt,5.55pt" o:gfxdata="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" strokeweight="1.5pt">
+              <v:line w14:anchorId="17E79139" id="Straight Connector 2" o:spid="_x0000_s1026" alt="Straight Connector 1260553175" style="position:absolute;z-index:251659264;visibility:visible;mso-wrap-style:square;mso-width-percent:0;mso-height-percent:0;mso-wrap-distance-left:0;mso-wrap-distance-top:-3e-5mm;mso-wrap-distance-right:0;mso-wrap-distance-bottom:-3e-5mm;mso-position-horizontal:center;mso-position-horizontal-relative:margin;mso-position-vertical:absolute;mso-position-vertical-relative:line;mso-width-percent:0;mso-height-percent:0;mso-width-relative:page;mso-height-relative:page" from="0,5.55pt" to="106.5pt,5.55pt" o:gfxdata="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" strokeweight="1.5pt">
                 <v:stroke joinstyle="miter"/>
                 <o:lock v:ext="edit" shapetype="f"/>
                 <w10:wrap anchorx="margin" anchory="line"/>
@@ -214,7 +229,13 @@
         <w:rPr>
           <w:lang w:val="de-DE"/>
         </w:rPr>
-        <w:t xml:space="preserve">FULL </w:t>
+        <w:t>FULL</w:t>
+      </w:r>
+      <w:r>
+        <w:rPr>
+          <w:lang w:val="de-DE"/>
+        </w:rPr>
+        <w:t>_</w:t>
       </w:r>
       <w:r>
         <w:rPr>
@@ -280,7 +301,13 @@
         <w:t>{</w:t>
       </w:r>
       <w:r>
-        <w:t>LAST NAME</w:t>
+        <w:t>LAST</w:t>
+      </w:r>
+      <w:r>
+        <w:t>_</w:t>
+      </w:r>
+      <w:r>
+        <w:t>NAME</w:t>
       </w:r>
       <w:r>
         <w:t>}</w:t>
@@ -390,6 +417,16 @@
           <w:bCs/>
         </w:rPr>
         <w:t>}</w:t>
+      </w:r>
+      <w:r>
+        <w:t xml:space="preserve"> </w:t>
+      </w:r>
+      <w:r>
+        <w:rPr>
+          <w:b/>
+          <w:bCs/>
+        </w:rPr>
+        <w:t>(Php${TOTAL_WITH_PENALTIES})</w:t>
       </w:r>
       <w:r>
         <w:t xml:space="preserve">, </w:t>
@@ -784,7 +821,27 @@
           <w:iCs/>
           <w:u w:val="thick"/>
         </w:rPr>
-        <w:t>HIGHEST_MONTHS</w:t>
+        <w:t>HIGHEST_</w:t>
+      </w:r>
+      <w:r>
+        <w:rPr>
+          <w:b/>
+          <w:bCs/>
+          <w:i/>
+          <w:iCs/>
+          <w:u w:val="thick"/>
+        </w:rPr>
+        <w:t>NUM_</w:t>
+      </w:r>
+      <w:r>
+        <w:rPr>
+          <w:b/>
+          <w:bCs/>
+          <w:i/>
+          <w:iCs/>
+          <w:u w:val="thick"/>
+        </w:rPr>
+        <w:t>MONTHS</w:t>
       </w:r>
       <w:r>
         <w:rPr>
@@ -832,6 +889,16 @@
           <w:u w:val="thick"/>
         </w:rPr>
         <w:t xml:space="preserve">TOTAL = </w:t>
+      </w:r>
+      <w:r>
+        <w:rPr>
+          <w:b/>
+          <w:bCs/>
+          <w:i/>
+          <w:iCs/>
+          <w:u w:val="thick"/>
+        </w:rPr>
+        <w:t>Php</w:t>
       </w:r>
       <w:r>
         <w:rPr>

</xml_diff>

<commit_message>
refactor(word-generator): migrate to poi-tl template engine
</commit_message>
<xml_diff>
--- a/src/main/resources/templates/demandtemplate.docx
+++ b/src/main/resources/templates/demandtemplate.docx
@@ -76,7 +76,10 @@
         <w:jc w:val="right"/>
       </w:pPr>
       <w:r>
-        <w:t>${</w:t>
+        <w:t>{</w:t>
+      </w:r>
+      <w:r>
+        <w:t>{</w:t>
       </w:r>
       <w:r>
         <w:t>CUR</w:t>
@@ -92,6 +95,9 @@
       </w:r>
       <w:r>
         <w:t>YEAR}</w:t>
+      </w:r>
+      <w:r>
+        <w:t>}</w:t>
       </w:r>
     </w:p>
     <w:p>
@@ -217,7 +223,7 @@
         <w:rPr>
           <w:lang w:val="de-DE"/>
         </w:rPr>
-        <w:t>$</w:t>
+        <w:t>{</w:t>
       </w:r>
       <w:r>
         <w:rPr>
@@ -242,6 +248,12 @@
           <w:lang w:val="de-DE"/>
         </w:rPr>
         <w:t>NAME}</w:t>
+      </w:r>
+      <w:r>
+        <w:rPr>
+          <w:lang w:val="de-DE"/>
+        </w:rPr>
+        <w:t>}</w:t>
       </w:r>
     </w:p>
     <w:p>
@@ -250,10 +262,16 @@
         <w:spacing w:after="0" w:line="240" w:lineRule="auto"/>
       </w:pPr>
       <w:r>
-        <w:t>${</w:t>
+        <w:t>{</w:t>
+      </w:r>
+      <w:r>
+        <w:t>{</w:t>
       </w:r>
       <w:r>
         <w:t>ADDRESS</w:t>
+      </w:r>
+      <w:r>
+        <w:t>}</w:t>
       </w:r>
       <w:r>
         <w:t>}</w:t>
@@ -265,13 +283,16 @@
         <w:spacing w:after="0" w:line="240" w:lineRule="auto"/>
       </w:pPr>
       <w:r>
-        <w:t>$</w:t>
-      </w:r>
-      <w:r>
         <w:t>{</w:t>
       </w:r>
       <w:r>
+        <w:t>{</w:t>
+      </w:r>
+      <w:r>
         <w:t>PHONE</w:t>
+      </w:r>
+      <w:r>
+        <w:t>}</w:t>
       </w:r>
       <w:r>
         <w:t>}</w:t>
@@ -295,12 +316,12 @@
         <w:t xml:space="preserve">Dear Mr. /Mrs </w:t>
       </w:r>
       <w:r>
-        <w:t>$</w:t>
-      </w:r>
-      <w:r>
         <w:t>{</w:t>
       </w:r>
       <w:r>
+        <w:t>{</w:t>
+      </w:r>
+      <w:r>
         <w:t>LAST</w:t>
       </w:r>
       <w:r>
@@ -308,6 +329,9 @@
       </w:r>
       <w:r>
         <w:t>NAME</w:t>
+      </w:r>
+      <w:r>
+        <w:t>}</w:t>
       </w:r>
       <w:r>
         <w:t>}</w:t>
@@ -395,13 +419,6 @@
           <w:b/>
           <w:bCs/>
         </w:rPr>
-        <w:t>$</w:t>
-      </w:r>
-      <w:r>
-        <w:rPr>
-          <w:b/>
-          <w:bCs/>
-        </w:rPr>
         <w:t>{</w:t>
       </w:r>
       <w:r>
@@ -409,6 +426,13 @@
           <w:b/>
           <w:bCs/>
         </w:rPr>
+        <w:t>{</w:t>
+      </w:r>
+      <w:r>
+        <w:rPr>
+          <w:b/>
+          <w:bCs/>
+        </w:rPr>
         <w:t>TOTAL_IN_WORDS</w:t>
       </w:r>
       <w:r>
@@ -419,6 +443,13 @@
         <w:t>}</w:t>
       </w:r>
       <w:r>
+        <w:rPr>
+          <w:b/>
+          <w:bCs/>
+        </w:rPr>
+        <w:t>}</w:t>
+      </w:r>
+      <w:r>
         <w:t xml:space="preserve"> </w:t>
       </w:r>
       <w:r>
@@ -426,7 +457,44 @@
           <w:b/>
           <w:bCs/>
         </w:rPr>
-        <w:t>(Php${TOTAL_WITH_PENALTIES})</w:t>
+        <w:t>(</w:t>
+      </w:r>
+      <w:proofErr w:type="spellStart"/>
+      <w:r>
+        <w:rPr>
+          <w:b/>
+          <w:bCs/>
+        </w:rPr>
+        <w:t>Php</w:t>
+      </w:r>
+      <w:proofErr w:type="spellEnd"/>
+      <w:r>
+        <w:rPr>
+          <w:b/>
+          <w:bCs/>
+        </w:rPr>
+        <w:t>{{</w:t>
+      </w:r>
+      <w:r>
+        <w:rPr>
+          <w:b/>
+          <w:bCs/>
+        </w:rPr>
+        <w:t>TOTAL_WITH_PENALTIES</w:t>
+      </w:r>
+      <w:r>
+        <w:rPr>
+          <w:b/>
+          <w:bCs/>
+        </w:rPr>
+        <w:t>}</w:t>
+      </w:r>
+      <w:r>
+        <w:rPr>
+          <w:b/>
+          <w:bCs/>
+        </w:rPr>
+        <w:t>})</w:t>
       </w:r>
       <w:r>
         <w:t xml:space="preserve">, </w:t>
@@ -714,16 +782,6 @@
           <w:iCs/>
           <w:u w:val="thick"/>
         </w:rPr>
-        <w:t>$</w:t>
-      </w:r>
-      <w:r>
-        <w:rPr>
-          <w:b/>
-          <w:bCs/>
-          <w:i/>
-          <w:iCs/>
-          <w:u w:val="thick"/>
-        </w:rPr>
         <w:t>{</w:t>
       </w:r>
       <w:r>
@@ -734,6 +792,16 @@
           <w:iCs/>
           <w:u w:val="thick"/>
         </w:rPr>
+        <w:t>{</w:t>
+      </w:r>
+      <w:r>
+        <w:rPr>
+          <w:b/>
+          <w:bCs/>
+          <w:i/>
+          <w:iCs/>
+          <w:u w:val="thick"/>
+        </w:rPr>
         <w:t>TOTAL</w:t>
       </w:r>
       <w:r>
@@ -755,6 +823,16 @@
           <w:u w:val="thick"/>
         </w:rPr>
         <w:t>GROSS</w:t>
+      </w:r>
+      <w:r>
+        <w:rPr>
+          <w:b/>
+          <w:bCs/>
+          <w:i/>
+          <w:iCs/>
+          <w:u w:val="thick"/>
+        </w:rPr>
+        <w:t>}</w:t>
       </w:r>
       <w:r>
         <w:rPr>
@@ -801,16 +879,6 @@
           <w:iCs/>
           <w:u w:val="thick"/>
         </w:rPr>
-        <w:t>$</w:t>
-      </w:r>
-      <w:r>
-        <w:rPr>
-          <w:b/>
-          <w:bCs/>
-          <w:i/>
-          <w:iCs/>
-          <w:u w:val="thick"/>
-        </w:rPr>
         <w:t>{</w:t>
       </w:r>
       <w:r>
@@ -821,6 +889,16 @@
           <w:iCs/>
           <w:u w:val="thick"/>
         </w:rPr>
+        <w:t>{</w:t>
+      </w:r>
+      <w:r>
+        <w:rPr>
+          <w:b/>
+          <w:bCs/>
+          <w:i/>
+          <w:iCs/>
+          <w:u w:val="thick"/>
+        </w:rPr>
         <w:t>HIGHEST_</w:t>
       </w:r>
       <w:r>
@@ -843,6 +921,7 @@
         </w:rPr>
         <w:t>MONTHS</w:t>
       </w:r>
+      <w:proofErr w:type="gramStart"/>
       <w:r>
         <w:rPr>
           <w:b/>
@@ -861,7 +940,28 @@
           <w:iCs/>
           <w:u w:val="thick"/>
         </w:rPr>
-        <w:t>mos. + 1,500 add fees)</w:t>
+        <w:t>}</w:t>
+      </w:r>
+      <w:r>
+        <w:rPr>
+          <w:b/>
+          <w:bCs/>
+          <w:i/>
+          <w:iCs/>
+          <w:u w:val="thick"/>
+        </w:rPr>
+        <w:t>mos.</w:t>
+      </w:r>
+      <w:proofErr w:type="gramEnd"/>
+      <w:r>
+        <w:rPr>
+          <w:b/>
+          <w:bCs/>
+          <w:i/>
+          <w:iCs/>
+          <w:u w:val="thick"/>
+        </w:rPr>
+        <w:t xml:space="preserve"> + 1,500 add fees)</w:t>
       </w:r>
     </w:p>
     <w:p>
@@ -890,6 +990,7 @@
         </w:rPr>
         <w:t xml:space="preserve">TOTAL = </w:t>
       </w:r>
+      <w:proofErr w:type="spellStart"/>
       <w:r>
         <w:rPr>
           <w:b/>
@@ -900,16 +1001,7 @@
         </w:rPr>
         <w:t>Php</w:t>
       </w:r>
-      <w:r>
-        <w:rPr>
-          <w:b/>
-          <w:bCs/>
-          <w:i/>
-          <w:iCs/>
-          <w:u w:val="thick"/>
-        </w:rPr>
-        <w:t>$</w:t>
-      </w:r>
+      <w:proofErr w:type="spellEnd"/>
       <w:r>
         <w:rPr>
           <w:b/>
@@ -928,7 +1020,27 @@
           <w:iCs/>
           <w:u w:val="thick"/>
         </w:rPr>
+        <w:t>{</w:t>
+      </w:r>
+      <w:r>
+        <w:rPr>
+          <w:b/>
+          <w:bCs/>
+          <w:i/>
+          <w:iCs/>
+          <w:u w:val="thick"/>
+        </w:rPr>
         <w:t>TOTAL_WITH_PENALTIES</w:t>
+      </w:r>
+      <w:r>
+        <w:rPr>
+          <w:b/>
+          <w:bCs/>
+          <w:i/>
+          <w:iCs/>
+          <w:u w:val="thick"/>
+        </w:rPr>
+        <w:t>}</w:t>
       </w:r>
       <w:r>
         <w:rPr>
@@ -975,13 +1087,6 @@
           <w:b/>
           <w:bCs/>
         </w:rPr>
-        <w:t>$</w:t>
-      </w:r>
-      <w:r>
-        <w:rPr>
-          <w:b/>
-          <w:bCs/>
-        </w:rPr>
         <w:t>{</w:t>
       </w:r>
       <w:r>
@@ -989,7 +1094,21 @@
           <w:b/>
           <w:bCs/>
         </w:rPr>
+        <w:t>{</w:t>
+      </w:r>
+      <w:r>
+        <w:rPr>
+          <w:b/>
+          <w:bCs/>
+        </w:rPr>
         <w:t>TOTAL_IN_WORDS</w:t>
+      </w:r>
+      <w:r>
+        <w:rPr>
+          <w:b/>
+          <w:bCs/>
+        </w:rPr>
+        <w:t>}</w:t>
       </w:r>
       <w:r>
         <w:rPr>
@@ -1042,7 +1161,28 @@
           <w:b/>
           <w:bCs/>
         </w:rPr>
-        <w:t xml:space="preserve">                                                                                                                                                     Very truly yours</w:t>
+        <w:t xml:space="preserve">                                                                                                                                                     </w:t>
+      </w:r>
+      <w:r>
+        <w:rPr>
+          <w:b/>
+          <w:bCs/>
+        </w:rPr>
+        <w:t xml:space="preserve">  </w:t>
+      </w:r>
+      <w:r>
+        <w:rPr>
+          <w:b/>
+          <w:bCs/>
+        </w:rPr>
+        <w:t xml:space="preserve"> </w:t>
+      </w:r>
+      <w:r>
+        <w:rPr>
+          <w:b/>
+          <w:bCs/>
+        </w:rPr>
+        <w:t>Very truly yours</w:t>
       </w:r>
     </w:p>
     <w:p>
@@ -1121,7 +1261,21 @@
           <w:bCs/>
         </w:rPr>
         <w:tab/>
-        <w:t xml:space="preserve">                                      Legal Counsel</w:t>
+        <w:t xml:space="preserve">                                     </w:t>
+      </w:r>
+      <w:r>
+        <w:rPr>
+          <w:b/>
+          <w:bCs/>
+        </w:rPr>
+        <w:t xml:space="preserve"> </w:t>
+      </w:r>
+      <w:r>
+        <w:rPr>
+          <w:b/>
+          <w:bCs/>
+        </w:rPr>
+        <w:t>Legal Counsel</w:t>
       </w:r>
       <w:r>
         <w:rPr>
@@ -1149,7 +1303,6 @@
         <w:t>RESHELLE G. JAGDON</w:t>
       </w:r>
     </w:p>
-    <w:p/>
     <w:sectPr>
       <w:headerReference w:type="default" r:id="rId6"/>
       <w:footerReference w:type="default" r:id="rId7"/>

</xml_diff>

<commit_message>
feat(word-generator): added table generation
</commit_message>
<xml_diff>
--- a/src/main/resources/templates/demandtemplate.docx
+++ b/src/main/resources/templates/demandtemplate.docx
@@ -76,22 +76,7 @@
         <w:jc w:val="right"/>
       </w:pPr>
       <w:r>
-        <w:t>${</w:t>
-      </w:r>
-      <w:r>
-        <w:t>CUR</w:t>
-      </w:r>
-      <w:r>
-        <w:t>_</w:t>
-      </w:r>
-      <w:r>
-        <w:t>MONTH</w:t>
-      </w:r>
-      <w:r>
-        <w:t>_</w:t>
-      </w:r>
-      <w:r>
-        <w:t>YEAR}</w:t>
+        <w:t>{{CUR_MONTH_YEAR}}</w:t>
       </w:r>
     </w:p>
     <w:p>
@@ -217,31 +202,7 @@
         <w:rPr>
           <w:lang w:val="de-DE"/>
         </w:rPr>
-        <w:t>$</w:t>
-      </w:r>
-      <w:r>
-        <w:rPr>
-          <w:lang w:val="de-DE"/>
-        </w:rPr>
-        <w:t>{</w:t>
-      </w:r>
-      <w:r>
-        <w:rPr>
-          <w:lang w:val="de-DE"/>
-        </w:rPr>
-        <w:t>FULL</w:t>
-      </w:r>
-      <w:r>
-        <w:rPr>
-          <w:lang w:val="de-DE"/>
-        </w:rPr>
-        <w:t>_</w:t>
-      </w:r>
-      <w:r>
-        <w:rPr>
-          <w:lang w:val="de-DE"/>
-        </w:rPr>
-        <w:t>NAME}</w:t>
+        <w:t>{{FULL_NAME}}</w:t>
       </w:r>
     </w:p>
     <w:p>
@@ -250,13 +211,7 @@
         <w:spacing w:after="0" w:line="240" w:lineRule="auto"/>
       </w:pPr>
       <w:r>
-        <w:t>${</w:t>
-      </w:r>
-      <w:r>
-        <w:t>ADDRESS</w:t>
-      </w:r>
-      <w:r>
-        <w:t>}</w:t>
+        <w:t>{{ADDRESS}}</w:t>
       </w:r>
     </w:p>
     <w:p>
@@ -265,16 +220,7 @@
         <w:spacing w:after="0" w:line="240" w:lineRule="auto"/>
       </w:pPr>
       <w:r>
-        <w:t>$</w:t>
-      </w:r>
-      <w:r>
-        <w:t>{</w:t>
-      </w:r>
-      <w:r>
-        <w:t>PHONE</w:t>
-      </w:r>
-      <w:r>
-        <w:t>}</w:t>
+        <w:t>{{PHONE}}</w:t>
       </w:r>
     </w:p>
     <w:p>
@@ -295,22 +241,7 @@
         <w:t xml:space="preserve">Dear Mr. /Mrs </w:t>
       </w:r>
       <w:r>
-        <w:t>$</w:t>
-      </w:r>
-      <w:r>
-        <w:t>{</w:t>
-      </w:r>
-      <w:r>
-        <w:t>LAST</w:t>
-      </w:r>
-      <w:r>
-        <w:t>_</w:t>
-      </w:r>
-      <w:r>
-        <w:t>NAME</w:t>
-      </w:r>
-      <w:r>
-        <w:t>}</w:t>
+        <w:t>{{LAST_NAME}}</w:t>
       </w:r>
       <w:r>
         <w:rPr>
@@ -395,30 +326,13 @@
           <w:b/>
           <w:bCs/>
         </w:rPr>
-        <w:t>$</w:t>
-      </w:r>
-      <w:r>
-        <w:rPr>
-          <w:b/>
-          <w:bCs/>
-        </w:rPr>
-        <w:t>{</w:t>
-      </w:r>
-      <w:r>
-        <w:rPr>
-          <w:b/>
-          <w:bCs/>
-        </w:rPr>
-        <w:t>TOTAL_IN_WORDS</w:t>
-      </w:r>
-      <w:r>
-        <w:rPr>
-          <w:b/>
-          <w:bCs/>
-        </w:rPr>
-        <w:t>}</w:t>
-      </w:r>
-      <w:r>
+        <w:t>{{TOTAL_IN_WORDS}}</w:t>
+      </w:r>
+      <w:r>
+        <w:rPr>
+          <w:b/>
+          <w:bCs/>
+        </w:rPr>
         <w:t xml:space="preserve"> </w:t>
       </w:r>
       <w:r>
@@ -426,7 +340,30 @@
           <w:b/>
           <w:bCs/>
         </w:rPr>
-        <w:t>(Php${TOTAL_WITH_PENALTIES})</w:t>
+        <w:t>(</w:t>
+      </w:r>
+      <w:proofErr w:type="spellStart"/>
+      <w:r>
+        <w:rPr>
+          <w:b/>
+          <w:bCs/>
+        </w:rPr>
+        <w:t>Php</w:t>
+      </w:r>
+      <w:proofErr w:type="spellEnd"/>
+      <w:r>
+        <w:rPr>
+          <w:b/>
+          <w:bCs/>
+        </w:rPr>
+        <w:t>{{TOTAL_WITH_PENALTIES}}</w:t>
+      </w:r>
+      <w:r>
+        <w:rPr>
+          <w:b/>
+          <w:bCs/>
+        </w:rPr>
+        <w:t>)</w:t>
       </w:r>
       <w:r>
         <w:t xml:space="preserve">, </w:t>
@@ -481,6 +418,7 @@
             <w:pPr>
               <w:pStyle w:val="Body"/>
               <w:spacing w:line="240" w:lineRule="auto"/>
+              <w:jc w:val="center"/>
             </w:pPr>
             <w:r>
               <w:rPr>
@@ -489,7 +427,7 @@
                 <w:sz w:val="20"/>
                 <w:szCs w:val="20"/>
               </w:rPr>
-              <w:t xml:space="preserve">        S.O # / TRA</w:t>
+              <w:t>S.O # / TRA</w:t>
             </w:r>
           </w:p>
         </w:tc>
@@ -560,93 +498,6 @@
           </w:p>
         </w:tc>
       </w:tr>
-      <w:tr>
-        <w:trPr>
-          <w:trHeight w:val="230"/>
-          <w:jc w:val="center"/>
-        </w:trPr>
-        <w:tc>
-          <w:tcPr>
-            <w:tcW w:w="1664" w:type="dxa"/>
-            <w:tcBorders>
-              <w:top w:val="single" w:sz="4" w:space="0" w:color="000000"/>
-              <w:left w:val="single" w:sz="4" w:space="0" w:color="000000"/>
-              <w:bottom w:val="single" w:sz="4" w:space="0" w:color="000000"/>
-              <w:right w:val="single" w:sz="4" w:space="0" w:color="000000"/>
-            </w:tcBorders>
-            <w:tcMar>
-              <w:top w:w="80" w:type="dxa"/>
-              <w:left w:w="80" w:type="dxa"/>
-              <w:bottom w:w="80" w:type="dxa"/>
-              <w:right w:w="80" w:type="dxa"/>
-            </w:tcMar>
-          </w:tcPr>
-          <w:p>
-            <w:pPr>
-              <w:pStyle w:val="Body"/>
-              <w:suppressAutoHyphens w:val="0"/>
-              <w:spacing w:after="0" w:line="240" w:lineRule="auto"/>
-            </w:pPr>
-            <w:r>
-              <w:t>${SO}</w:t>
-            </w:r>
-          </w:p>
-        </w:tc>
-        <w:tc>
-          <w:tcPr>
-            <w:tcW w:w="2532" w:type="dxa"/>
-            <w:tcBorders>
-              <w:top w:val="single" w:sz="4" w:space="0" w:color="000000"/>
-              <w:left w:val="single" w:sz="4" w:space="0" w:color="000000"/>
-              <w:bottom w:val="single" w:sz="4" w:space="0" w:color="000000"/>
-              <w:right w:val="single" w:sz="4" w:space="0" w:color="000000"/>
-            </w:tcBorders>
-            <w:tcMar>
-              <w:top w:w="80" w:type="dxa"/>
-              <w:left w:w="80" w:type="dxa"/>
-              <w:bottom w:w="80" w:type="dxa"/>
-              <w:right w:w="80" w:type="dxa"/>
-            </w:tcMar>
-          </w:tcPr>
-          <w:p>
-            <w:pPr>
-              <w:pStyle w:val="Body"/>
-              <w:spacing w:after="0" w:line="240" w:lineRule="auto"/>
-            </w:pPr>
-            <w:r>
-              <w:t>${UNSETTLED}</w:t>
-            </w:r>
-          </w:p>
-        </w:tc>
-        <w:tc>
-          <w:tcPr>
-            <w:tcW w:w="2530" w:type="dxa"/>
-            <w:tcBorders>
-              <w:top w:val="single" w:sz="4" w:space="0" w:color="000000"/>
-              <w:left w:val="single" w:sz="4" w:space="0" w:color="000000"/>
-              <w:bottom w:val="single" w:sz="4" w:space="0" w:color="000000"/>
-              <w:right w:val="single" w:sz="4" w:space="0" w:color="000000"/>
-            </w:tcBorders>
-            <w:tcMar>
-              <w:top w:w="80" w:type="dxa"/>
-              <w:left w:w="80" w:type="dxa"/>
-              <w:bottom w:w="80" w:type="dxa"/>
-              <w:right w:w="80" w:type="dxa"/>
-            </w:tcMar>
-          </w:tcPr>
-          <w:p>
-            <w:pPr>
-              <w:pStyle w:val="Body"/>
-              <w:suppressAutoHyphens w:val="0"/>
-              <w:spacing w:after="0" w:line="240" w:lineRule="auto"/>
-              <w:jc w:val="center"/>
-            </w:pPr>
-            <w:r>
-              <w:t>${DUE_DATE}</w:t>
-            </w:r>
-          </w:p>
-        </w:tc>
-      </w:tr>
     </w:tbl>
     <w:p>
       <w:pPr>
@@ -714,57 +565,7 @@
           <w:iCs/>
           <w:u w:val="thick"/>
         </w:rPr>
-        <w:t>$</w:t>
-      </w:r>
-      <w:r>
-        <w:rPr>
-          <w:b/>
-          <w:bCs/>
-          <w:i/>
-          <w:iCs/>
-          <w:u w:val="thick"/>
-        </w:rPr>
-        <w:t>{</w:t>
-      </w:r>
-      <w:r>
-        <w:rPr>
-          <w:b/>
-          <w:bCs/>
-          <w:i/>
-          <w:iCs/>
-          <w:u w:val="thick"/>
-        </w:rPr>
-        <w:t>TOTAL</w:t>
-      </w:r>
-      <w:r>
-        <w:rPr>
-          <w:b/>
-          <w:bCs/>
-          <w:i/>
-          <w:iCs/>
-          <w:u w:val="thick"/>
-        </w:rPr>
-        <w:t>_</w:t>
-      </w:r>
-      <w:r>
-        <w:rPr>
-          <w:b/>
-          <w:bCs/>
-          <w:i/>
-          <w:iCs/>
-          <w:u w:val="thick"/>
-        </w:rPr>
-        <w:t>GROSS</w:t>
-      </w:r>
-      <w:r>
-        <w:rPr>
-          <w:b/>
-          <w:bCs/>
-          <w:i/>
-          <w:iCs/>
-          <w:u w:val="thick"/>
-        </w:rPr>
-        <w:t>}</w:t>
+        <w:t>{{TOTAL_GROSS}}</w:t>
       </w:r>
     </w:p>
     <w:p>
@@ -801,57 +602,7 @@
           <w:iCs/>
           <w:u w:val="thick"/>
         </w:rPr>
-        <w:t>$</w:t>
-      </w:r>
-      <w:r>
-        <w:rPr>
-          <w:b/>
-          <w:bCs/>
-          <w:i/>
-          <w:iCs/>
-          <w:u w:val="thick"/>
-        </w:rPr>
-        <w:t>{</w:t>
-      </w:r>
-      <w:r>
-        <w:rPr>
-          <w:b/>
-          <w:bCs/>
-          <w:i/>
-          <w:iCs/>
-          <w:u w:val="thick"/>
-        </w:rPr>
-        <w:t>HIGHEST_</w:t>
-      </w:r>
-      <w:r>
-        <w:rPr>
-          <w:b/>
-          <w:bCs/>
-          <w:i/>
-          <w:iCs/>
-          <w:u w:val="thick"/>
-        </w:rPr>
-        <w:t>NUM_</w:t>
-      </w:r>
-      <w:r>
-        <w:rPr>
-          <w:b/>
-          <w:bCs/>
-          <w:i/>
-          <w:iCs/>
-          <w:u w:val="thick"/>
-        </w:rPr>
-        <w:t>MONTHS</w:t>
-      </w:r>
-      <w:r>
-        <w:rPr>
-          <w:b/>
-          <w:bCs/>
-          <w:i/>
-          <w:iCs/>
-          <w:u w:val="thick"/>
-        </w:rPr>
-        <w:t>}</w:t>
+        <w:t>{{HIGHEST_NUM_MONTHS}}</w:t>
       </w:r>
       <w:r>
         <w:rPr>
@@ -890,6 +641,7 @@
         </w:rPr>
         <w:t xml:space="preserve">TOTAL = </w:t>
       </w:r>
+      <w:proofErr w:type="spellStart"/>
       <w:r>
         <w:rPr>
           <w:b/>
@@ -900,6 +652,7 @@
         </w:rPr>
         <w:t>Php</w:t>
       </w:r>
+      <w:proofErr w:type="spellEnd"/>
       <w:r>
         <w:rPr>
           <w:b/>
@@ -908,37 +661,7 @@
           <w:iCs/>
           <w:u w:val="thick"/>
         </w:rPr>
-        <w:t>$</w:t>
-      </w:r>
-      <w:r>
-        <w:rPr>
-          <w:b/>
-          <w:bCs/>
-          <w:i/>
-          <w:iCs/>
-          <w:u w:val="thick"/>
-        </w:rPr>
-        <w:t>{</w:t>
-      </w:r>
-      <w:r>
-        <w:rPr>
-          <w:b/>
-          <w:bCs/>
-          <w:i/>
-          <w:iCs/>
-          <w:u w:val="thick"/>
-        </w:rPr>
-        <w:t>TOTAL_WITH_PENALTIES</w:t>
-      </w:r>
-      <w:r>
-        <w:rPr>
-          <w:b/>
-          <w:bCs/>
-          <w:i/>
-          <w:iCs/>
-          <w:u w:val="thick"/>
-        </w:rPr>
-        <w:t>}</w:t>
+        <w:t>{{TOTAL_WITH_PENALTIES}}</w:t>
       </w:r>
     </w:p>
     <w:p>
@@ -975,28 +698,7 @@
           <w:b/>
           <w:bCs/>
         </w:rPr>
-        <w:t>$</w:t>
-      </w:r>
-      <w:r>
-        <w:rPr>
-          <w:b/>
-          <w:bCs/>
-        </w:rPr>
-        <w:t>{</w:t>
-      </w:r>
-      <w:r>
-        <w:rPr>
-          <w:b/>
-          <w:bCs/>
-        </w:rPr>
-        <w:t>TOTAL_IN_WORDS</w:t>
-      </w:r>
-      <w:r>
-        <w:rPr>
-          <w:b/>
-          <w:bCs/>
-        </w:rPr>
-        <w:t>}</w:t>
+        <w:t>{{TOTAL_IN_WORDS}}</w:t>
       </w:r>
       <w:r>
         <w:t xml:space="preserve"> </w:t>
@@ -1042,7 +744,21 @@
           <w:b/>
           <w:bCs/>
         </w:rPr>
-        <w:t xml:space="preserve">                                                                                                                                                     Very truly yours</w:t>
+        <w:t xml:space="preserve">                                                                                                                                                     </w:t>
+      </w:r>
+      <w:r>
+        <w:rPr>
+          <w:b/>
+          <w:bCs/>
+        </w:rPr>
+        <w:t xml:space="preserve">  </w:t>
+      </w:r>
+      <w:r>
+        <w:rPr>
+          <w:b/>
+          <w:bCs/>
+        </w:rPr>
+        <w:t>Very truly yours</w:t>
       </w:r>
     </w:p>
     <w:p>
@@ -1149,7 +865,6 @@
         <w:t>RESHELLE G. JAGDON</w:t>
       </w:r>
     </w:p>
-    <w:p/>
     <w:sectPr>
       <w:headerReference w:type="default" r:id="rId6"/>
       <w:footerReference w:type="default" r:id="rId7"/>

</xml_diff>

<commit_message>
fix: slight document template modifications
</commit_message>
<xml_diff>
--- a/src/main/resources/templates/demandtemplate.docx
+++ b/src/main/resources/templates/demandtemplate.docx
@@ -602,8 +602,9 @@
           <w:iCs/>
           <w:u w:val="thick"/>
         </w:rPr>
-        <w:t>{{HIGHEST_NUM_MONTHS}}</w:t>
-      </w:r>
+        <w:t>{{HIGHEST_NUM_MONTHS</w:t>
+      </w:r>
+      <w:proofErr w:type="gramStart"/>
       <w:r>
         <w:rPr>
           <w:b/>
@@ -612,7 +613,28 @@
           <w:iCs/>
           <w:u w:val="thick"/>
         </w:rPr>
-        <w:t>mos. + 1,500 add fees)</w:t>
+        <w:t>}}</w:t>
+      </w:r>
+      <w:r>
+        <w:rPr>
+          <w:b/>
+          <w:bCs/>
+          <w:i/>
+          <w:iCs/>
+          <w:u w:val="thick"/>
+        </w:rPr>
+        <w:t>mos.</w:t>
+      </w:r>
+      <w:proofErr w:type="gramEnd"/>
+      <w:r>
+        <w:rPr>
+          <w:b/>
+          <w:bCs/>
+          <w:i/>
+          <w:iCs/>
+          <w:u w:val="thick"/>
+        </w:rPr>
+        <w:t xml:space="preserve"> + 1,500 add fees)</w:t>
       </w:r>
     </w:p>
     <w:p>
@@ -727,127 +749,173 @@
         <w:t>We trust that you will give this matter your immediate and preferential attention.</w:t>
       </w:r>
     </w:p>
-    <w:p>
-      <w:pPr>
-        <w:pStyle w:val="Body"/>
-        <w:tabs>
-          <w:tab w:val="left" w:pos="3645"/>
-        </w:tabs>
-        <w:spacing w:line="240" w:lineRule="auto"/>
-        <w:rPr>
-          <w:b/>
-          <w:bCs/>
-        </w:rPr>
-      </w:pPr>
-      <w:r>
-        <w:rPr>
-          <w:b/>
-          <w:bCs/>
-        </w:rPr>
-        <w:t xml:space="preserve">                                                                                                                                                     </w:t>
-      </w:r>
-      <w:r>
-        <w:rPr>
-          <w:b/>
-          <w:bCs/>
-        </w:rPr>
-        <w:t xml:space="preserve">  </w:t>
-      </w:r>
-      <w:r>
-        <w:rPr>
-          <w:b/>
-          <w:bCs/>
-        </w:rPr>
-        <w:t>Very truly yours</w:t>
-      </w:r>
-    </w:p>
-    <w:p>
-      <w:pPr>
-        <w:pStyle w:val="Body"/>
-        <w:tabs>
-          <w:tab w:val="left" w:pos="3645"/>
-        </w:tabs>
-        <w:spacing w:line="240" w:lineRule="auto"/>
-        <w:jc w:val="center"/>
-        <w:rPr>
-          <w:b/>
-          <w:bCs/>
-        </w:rPr>
-      </w:pPr>
-      <w:r>
-        <w:rPr>
-          <w:b/>
-          <w:bCs/>
-        </w:rPr>
-        <w:t xml:space="preserve">  </w:t>
-      </w:r>
-      <w:r>
-        <w:rPr>
-          <w:b/>
-          <w:bCs/>
-        </w:rPr>
-        <w:tab/>
-      </w:r>
-      <w:r>
-        <w:rPr>
-          <w:b/>
-          <w:bCs/>
-        </w:rPr>
-        <w:tab/>
-      </w:r>
-      <w:r>
-        <w:rPr>
-          <w:b/>
-          <w:bCs/>
-        </w:rPr>
-        <w:tab/>
-      </w:r>
-      <w:r>
-        <w:rPr>
-          <w:b/>
-          <w:bCs/>
-        </w:rPr>
-        <w:tab/>
-        <w:t xml:space="preserve">                          ATTY. KEVIN P. PALACIO    In my instance: </w:t>
-      </w:r>
-      <w:r>
-        <w:rPr>
-          <w:b/>
-          <w:bCs/>
-        </w:rPr>
-        <w:tab/>
-      </w:r>
-      <w:r>
-        <w:rPr>
-          <w:b/>
-          <w:bCs/>
-        </w:rPr>
-        <w:tab/>
-      </w:r>
-      <w:r>
-        <w:rPr>
-          <w:b/>
-          <w:bCs/>
-        </w:rPr>
-        <w:tab/>
-      </w:r>
-      <w:r>
-        <w:rPr>
-          <w:b/>
-          <w:bCs/>
-        </w:rPr>
-        <w:tab/>
-        <w:t xml:space="preserve">                                      Legal Counsel</w:t>
-      </w:r>
-      <w:r>
-        <w:rPr>
-          <w:b/>
-          <w:bCs/>
-        </w:rPr>
-        <w:tab/>
-        <w:t xml:space="preserve"> </w:t>
-      </w:r>
-    </w:p>
+    <w:tbl>
+      <w:tblPr>
+        <w:tblStyle w:val="TableGrid"/>
+        <w:tblW w:w="0" w:type="auto"/>
+        <w:tblBorders>
+          <w:top w:val="none" w:sz="0" w:space="0" w:color="auto"/>
+          <w:left w:val="none" w:sz="0" w:space="0" w:color="auto"/>
+          <w:bottom w:val="none" w:sz="0" w:space="0" w:color="auto"/>
+          <w:right w:val="none" w:sz="0" w:space="0" w:color="auto"/>
+          <w:insideH w:val="none" w:sz="0" w:space="0" w:color="auto"/>
+          <w:insideV w:val="none" w:sz="0" w:space="0" w:color="auto"/>
+        </w:tblBorders>
+        <w:tblLook w:val="04A0" w:firstRow="1" w:lastRow="0" w:firstColumn="1" w:lastColumn="0" w:noHBand="0" w:noVBand="1"/>
+      </w:tblPr>
+      <w:tblGrid>
+        <w:gridCol w:w="2785"/>
+        <w:gridCol w:w="3510"/>
+        <w:gridCol w:w="3055"/>
+      </w:tblGrid>
+      <w:tr>
+        <w:trPr>
+          <w:trHeight w:val="1286"/>
+        </w:trPr>
+        <w:tc>
+          <w:tcPr>
+            <w:tcW w:w="2785" w:type="dxa"/>
+          </w:tcPr>
+          <w:p>
+            <w:pPr>
+              <w:pStyle w:val="Body"/>
+              <w:pBdr>
+                <w:top w:val="none" w:sz="0" w:space="0" w:color="auto"/>
+                <w:left w:val="none" w:sz="0" w:space="0" w:color="auto"/>
+                <w:bottom w:val="none" w:sz="0" w:space="0" w:color="auto"/>
+                <w:right w:val="none" w:sz="0" w:space="0" w:color="auto"/>
+                <w:between w:val="none" w:sz="0" w:space="0" w:color="auto"/>
+                <w:bar w:val="none" w:sz="0" w:color="auto"/>
+              </w:pBdr>
+              <w:tabs>
+                <w:tab w:val="left" w:pos="3645"/>
+              </w:tabs>
+              <w:spacing w:before="240" w:line="240" w:lineRule="auto"/>
+            </w:pPr>
+          </w:p>
+          <w:p>
+            <w:pPr>
+              <w:pStyle w:val="Body"/>
+              <w:pBdr>
+                <w:top w:val="none" w:sz="0" w:space="0" w:color="auto"/>
+                <w:left w:val="none" w:sz="0" w:space="0" w:color="auto"/>
+                <w:bottom w:val="none" w:sz="0" w:space="0" w:color="auto"/>
+                <w:right w:val="none" w:sz="0" w:space="0" w:color="auto"/>
+                <w:between w:val="none" w:sz="0" w:space="0" w:color="auto"/>
+                <w:bar w:val="none" w:sz="0" w:color="auto"/>
+              </w:pBdr>
+              <w:tabs>
+                <w:tab w:val="left" w:pos="3645"/>
+              </w:tabs>
+              <w:spacing w:before="240" w:line="240" w:lineRule="auto"/>
+              <w:rPr>
+                <w:b/>
+                <w:bCs/>
+              </w:rPr>
+            </w:pPr>
+            <w:r>
+              <w:rPr>
+                <w:b/>
+                <w:bCs/>
+              </w:rPr>
+              <w:t>In my Instance:</w:t>
+            </w:r>
+            <w:r>
+              <w:rPr>
+                <w:b/>
+                <w:bCs/>
+              </w:rPr>
+              <w:br/>
+              <w:t>RESHELLE G. JAGDON</w:t>
+            </w:r>
+          </w:p>
+        </w:tc>
+        <w:tc>
+          <w:tcPr>
+            <w:tcW w:w="3510" w:type="dxa"/>
+          </w:tcPr>
+          <w:p>
+            <w:pPr>
+              <w:pStyle w:val="Body"/>
+              <w:pBdr>
+                <w:top w:val="none" w:sz="0" w:space="0" w:color="auto"/>
+                <w:left w:val="none" w:sz="0" w:space="0" w:color="auto"/>
+                <w:bottom w:val="none" w:sz="0" w:space="0" w:color="auto"/>
+                <w:right w:val="none" w:sz="0" w:space="0" w:color="auto"/>
+                <w:between w:val="none" w:sz="0" w:space="0" w:color="auto"/>
+                <w:bar w:val="none" w:sz="0" w:color="auto"/>
+              </w:pBdr>
+              <w:tabs>
+                <w:tab w:val="left" w:pos="3645"/>
+              </w:tabs>
+              <w:spacing w:line="240" w:lineRule="auto"/>
+              <w:jc w:val="both"/>
+            </w:pPr>
+          </w:p>
+        </w:tc>
+        <w:tc>
+          <w:tcPr>
+            <w:tcW w:w="3055" w:type="dxa"/>
+          </w:tcPr>
+          <w:p>
+            <w:pPr>
+              <w:pStyle w:val="Body"/>
+              <w:tabs>
+                <w:tab w:val="left" w:pos="3645"/>
+              </w:tabs>
+              <w:spacing w:line="240" w:lineRule="auto"/>
+              <w:jc w:val="center"/>
+              <w:rPr>
+                <w:b/>
+                <w:bCs/>
+              </w:rPr>
+            </w:pPr>
+            <w:r>
+              <w:rPr>
+                <w:b/>
+                <w:bCs/>
+              </w:rPr>
+              <w:t>Very truly yours</w:t>
+            </w:r>
+          </w:p>
+          <w:p>
+            <w:pPr>
+              <w:pStyle w:val="Body"/>
+              <w:tabs>
+                <w:tab w:val="left" w:pos="3645"/>
+              </w:tabs>
+              <w:spacing w:line="240" w:lineRule="auto"/>
+              <w:jc w:val="center"/>
+              <w:rPr>
+                <w:b/>
+                <w:bCs/>
+              </w:rPr>
+            </w:pPr>
+          </w:p>
+          <w:p>
+            <w:pPr>
+              <w:pStyle w:val="Body"/>
+              <w:tabs>
+                <w:tab w:val="left" w:pos="3645"/>
+              </w:tabs>
+              <w:spacing w:line="276" w:lineRule="auto"/>
+              <w:jc w:val="center"/>
+              <w:rPr>
+                <w:b/>
+                <w:bCs/>
+              </w:rPr>
+            </w:pPr>
+            <w:r>
+              <w:rPr>
+                <w:b/>
+                <w:bCs/>
+              </w:rPr>
+              <w:t>ATTY. KEVIN P. PALACIO                                       Legal Counsel</w:t>
+            </w:r>
+          </w:p>
+        </w:tc>
+      </w:tr>
+    </w:tbl>
     <w:p>
       <w:pPr>
         <w:pStyle w:val="Body"/>
@@ -856,14 +924,6 @@
         </w:tabs>
         <w:spacing w:line="240" w:lineRule="auto"/>
       </w:pPr>
-      <w:r>
-        <w:rPr>
-          <w:b/>
-          <w:bCs/>
-          <w:lang w:val="de-DE"/>
-        </w:rPr>
-        <w:t>RESHELLE G. JAGDON</w:t>
-      </w:r>
     </w:p>
     <w:sectPr>
       <w:headerReference w:type="default" r:id="rId6"/>
@@ -2154,6 +2214,25 @@
       <w14:ligatures w14:val="none"/>
     </w:rPr>
   </w:style>
+  <w:style w:type="table" w:styleId="TableGrid">
+    <w:name w:val="Table Grid"/>
+    <w:basedOn w:val="TableNormal"/>
+    <w:uiPriority w:val="39"/>
+    <w:rsid w:val="00A67FD4"/>
+    <w:pPr>
+      <w:spacing w:after="0" w:line="240" w:lineRule="auto"/>
+    </w:pPr>
+    <w:tblPr>
+      <w:tblBorders>
+        <w:top w:val="single" w:sz="4" w:space="0" w:color="auto"/>
+        <w:left w:val="single" w:sz="4" w:space="0" w:color="auto"/>
+        <w:bottom w:val="single" w:sz="4" w:space="0" w:color="auto"/>
+        <w:right w:val="single" w:sz="4" w:space="0" w:color="auto"/>
+        <w:insideH w:val="single" w:sz="4" w:space="0" w:color="auto"/>
+        <w:insideV w:val="single" w:sz="4" w:space="0" w:color="auto"/>
+      </w:tblBorders>
+    </w:tblPr>
+  </w:style>
 </w:styles>
 </file>
 

</xml_diff>

<commit_message>
fix: reverted template modification
</commit_message>
<xml_diff>
--- a/src/main/resources/templates/demandtemplate.docx
+++ b/src/main/resources/templates/demandtemplate.docx
@@ -749,180 +749,141 @@
         <w:t>We trust that you will give this matter your immediate and preferential attention.</w:t>
       </w:r>
     </w:p>
-    <w:tbl>
-      <w:tblPr>
-        <w:tblStyle w:val="TableGrid"/>
-        <w:tblW w:w="0" w:type="auto"/>
-        <w:tblBorders>
-          <w:top w:val="none" w:sz="0" w:space="0" w:color="auto"/>
-          <w:left w:val="none" w:sz="0" w:space="0" w:color="auto"/>
-          <w:bottom w:val="none" w:sz="0" w:space="0" w:color="auto"/>
-          <w:right w:val="none" w:sz="0" w:space="0" w:color="auto"/>
-          <w:insideH w:val="none" w:sz="0" w:space="0" w:color="auto"/>
-          <w:insideV w:val="none" w:sz="0" w:space="0" w:color="auto"/>
-        </w:tblBorders>
-        <w:tblLook w:val="04A0" w:firstRow="1" w:lastRow="0" w:firstColumn="1" w:lastColumn="0" w:noHBand="0" w:noVBand="1"/>
-      </w:tblPr>
-      <w:tblGrid>
-        <w:gridCol w:w="2785"/>
-        <w:gridCol w:w="3510"/>
-        <w:gridCol w:w="3055"/>
-      </w:tblGrid>
-      <w:tr>
-        <w:trPr>
-          <w:trHeight w:val="1286"/>
-        </w:trPr>
-        <w:tc>
-          <w:tcPr>
-            <w:tcW w:w="2785" w:type="dxa"/>
-          </w:tcPr>
-          <w:p>
-            <w:pPr>
-              <w:pStyle w:val="Body"/>
-              <w:pBdr>
-                <w:top w:val="none" w:sz="0" w:space="0" w:color="auto"/>
-                <w:left w:val="none" w:sz="0" w:space="0" w:color="auto"/>
-                <w:bottom w:val="none" w:sz="0" w:space="0" w:color="auto"/>
-                <w:right w:val="none" w:sz="0" w:space="0" w:color="auto"/>
-                <w:between w:val="none" w:sz="0" w:space="0" w:color="auto"/>
-                <w:bar w:val="none" w:sz="0" w:color="auto"/>
-              </w:pBdr>
-              <w:tabs>
-                <w:tab w:val="left" w:pos="3645"/>
-              </w:tabs>
-              <w:spacing w:before="240" w:line="240" w:lineRule="auto"/>
-            </w:pPr>
-          </w:p>
-          <w:p>
-            <w:pPr>
-              <w:pStyle w:val="Body"/>
-              <w:pBdr>
-                <w:top w:val="none" w:sz="0" w:space="0" w:color="auto"/>
-                <w:left w:val="none" w:sz="0" w:space="0" w:color="auto"/>
-                <w:bottom w:val="none" w:sz="0" w:space="0" w:color="auto"/>
-                <w:right w:val="none" w:sz="0" w:space="0" w:color="auto"/>
-                <w:between w:val="none" w:sz="0" w:space="0" w:color="auto"/>
-                <w:bar w:val="none" w:sz="0" w:color="auto"/>
-              </w:pBdr>
-              <w:tabs>
-                <w:tab w:val="left" w:pos="3645"/>
-              </w:tabs>
-              <w:spacing w:before="240" w:line="240" w:lineRule="auto"/>
-              <w:rPr>
-                <w:b/>
-                <w:bCs/>
-              </w:rPr>
-            </w:pPr>
-            <w:r>
-              <w:rPr>
-                <w:b/>
-                <w:bCs/>
-              </w:rPr>
-              <w:t>In my Instance:</w:t>
-            </w:r>
-            <w:r>
-              <w:rPr>
-                <w:b/>
-                <w:bCs/>
-              </w:rPr>
-              <w:br/>
-              <w:t>RESHELLE G. JAGDON</w:t>
-            </w:r>
-          </w:p>
-        </w:tc>
-        <w:tc>
-          <w:tcPr>
-            <w:tcW w:w="3510" w:type="dxa"/>
-          </w:tcPr>
-          <w:p>
-            <w:pPr>
-              <w:pStyle w:val="Body"/>
-              <w:pBdr>
-                <w:top w:val="none" w:sz="0" w:space="0" w:color="auto"/>
-                <w:left w:val="none" w:sz="0" w:space="0" w:color="auto"/>
-                <w:bottom w:val="none" w:sz="0" w:space="0" w:color="auto"/>
-                <w:right w:val="none" w:sz="0" w:space="0" w:color="auto"/>
-                <w:between w:val="none" w:sz="0" w:space="0" w:color="auto"/>
-                <w:bar w:val="none" w:sz="0" w:color="auto"/>
-              </w:pBdr>
-              <w:tabs>
-                <w:tab w:val="left" w:pos="3645"/>
-              </w:tabs>
-              <w:spacing w:line="240" w:lineRule="auto"/>
-              <w:jc w:val="both"/>
-            </w:pPr>
-          </w:p>
-        </w:tc>
-        <w:tc>
-          <w:tcPr>
-            <w:tcW w:w="3055" w:type="dxa"/>
-          </w:tcPr>
-          <w:p>
-            <w:pPr>
-              <w:pStyle w:val="Body"/>
-              <w:tabs>
-                <w:tab w:val="left" w:pos="3645"/>
-              </w:tabs>
-              <w:spacing w:line="240" w:lineRule="auto"/>
-              <w:jc w:val="center"/>
-              <w:rPr>
-                <w:b/>
-                <w:bCs/>
-              </w:rPr>
-            </w:pPr>
-            <w:r>
-              <w:rPr>
-                <w:b/>
-                <w:bCs/>
-              </w:rPr>
-              <w:t>Very truly yours</w:t>
-            </w:r>
-          </w:p>
-          <w:p>
-            <w:pPr>
-              <w:pStyle w:val="Body"/>
-              <w:tabs>
-                <w:tab w:val="left" w:pos="3645"/>
-              </w:tabs>
-              <w:spacing w:line="240" w:lineRule="auto"/>
-              <w:jc w:val="center"/>
-              <w:rPr>
-                <w:b/>
-                <w:bCs/>
-              </w:rPr>
-            </w:pPr>
-          </w:p>
-          <w:p>
-            <w:pPr>
-              <w:pStyle w:val="Body"/>
-              <w:tabs>
-                <w:tab w:val="left" w:pos="3645"/>
-              </w:tabs>
-              <w:spacing w:line="276" w:lineRule="auto"/>
-              <w:jc w:val="center"/>
-              <w:rPr>
-                <w:b/>
-                <w:bCs/>
-              </w:rPr>
-            </w:pPr>
-            <w:r>
-              <w:rPr>
-                <w:b/>
-                <w:bCs/>
-              </w:rPr>
-              <w:t>ATTY. KEVIN P. PALACIO                                       Legal Counsel</w:t>
-            </w:r>
-          </w:p>
-        </w:tc>
-      </w:tr>
-    </w:tbl>
-    <w:p>
-      <w:pPr>
-        <w:pStyle w:val="Body"/>
+    <w:p>
+      <w:pPr>
+        <w:pStyle w:val="Body"/>
+        <w:keepNext/>
         <w:tabs>
           <w:tab w:val="left" w:pos="3645"/>
         </w:tabs>
         <w:spacing w:line="240" w:lineRule="auto"/>
+        <w:rPr>
+          <w:b/>
+          <w:bCs/>
+        </w:rPr>
+      </w:pPr>
+      <w:r>
+        <w:rPr>
+          <w:b/>
+          <w:bCs/>
+        </w:rPr>
+        <w:t xml:space="preserve">                                                                                                                                                     Very truly yours</w:t>
+      </w:r>
+    </w:p>
+    <w:p>
+      <w:pPr>
+        <w:pStyle w:val="Body"/>
+        <w:keepNext/>
+        <w:tabs>
+          <w:tab w:val="left" w:pos="3645"/>
+        </w:tabs>
+        <w:spacing w:line="240" w:lineRule="auto"/>
+        <w:jc w:val="center"/>
+        <w:rPr>
+          <w:b/>
+          <w:bCs/>
+        </w:rPr>
+      </w:pPr>
+      <w:r>
+        <w:rPr>
+          <w:b/>
+          <w:bCs/>
+        </w:rPr>
+        <w:t xml:space="preserve">  </w:t>
+      </w:r>
+      <w:r>
+        <w:rPr>
+          <w:b/>
+          <w:bCs/>
+        </w:rPr>
+        <w:tab/>
+      </w:r>
+      <w:r>
+        <w:rPr>
+          <w:b/>
+          <w:bCs/>
+        </w:rPr>
+        <w:tab/>
+      </w:r>
+      <w:r>
+        <w:rPr>
+          <w:b/>
+          <w:bCs/>
+        </w:rPr>
+        <w:tab/>
+      </w:r>
+      <w:r>
+        <w:rPr>
+          <w:b/>
+          <w:bCs/>
+        </w:rPr>
+        <w:tab/>
+        <w:t xml:space="preserve">                          ATTY. KEVIN P. PALACIO    In my instance: </w:t>
+      </w:r>
+      <w:r>
+        <w:rPr>
+          <w:b/>
+          <w:bCs/>
+        </w:rPr>
+        <w:tab/>
+      </w:r>
+      <w:r>
+        <w:rPr>
+          <w:b/>
+          <w:bCs/>
+        </w:rPr>
+        <w:tab/>
+      </w:r>
+      <w:r>
+        <w:rPr>
+          <w:b/>
+          <w:bCs/>
+        </w:rPr>
+        <w:tab/>
+      </w:r>
+      <w:r>
+        <w:rPr>
+          <w:b/>
+          <w:bCs/>
+        </w:rPr>
+        <w:tab/>
+        <w:t xml:space="preserve">                                      Legal Counsel</w:t>
+      </w:r>
+      <w:r>
+        <w:rPr>
+          <w:b/>
+          <w:bCs/>
+        </w:rPr>
+        <w:tab/>
+        <w:t xml:space="preserve"> </w:t>
+      </w:r>
+    </w:p>
+    <w:p>
+      <w:pPr>
+        <w:pStyle w:val="Body"/>
+        <w:keepNext/>
+        <w:tabs>
+          <w:tab w:val="left" w:pos="3645"/>
+        </w:tabs>
+        <w:spacing w:line="240" w:lineRule="auto"/>
+      </w:pPr>
+      <w:r>
+        <w:rPr>
+          <w:b/>
+          <w:bCs/>
+          <w:lang w:val="de-DE"/>
+        </w:rPr>
+        <w:t>RESHELLE G. JAGDON</w:t>
+      </w:r>
+    </w:p>
+    <w:p>
+      <w:pPr>
+        <w:pStyle w:val="Body"/>
+        <w:tabs>
+          <w:tab w:val="left" w:pos="3645"/>
+        </w:tabs>
+        <w:spacing w:line="240" w:lineRule="auto"/>
+        <w:jc w:val="both"/>
       </w:pPr>
     </w:p>
     <w:sectPr>

</xml_diff>

<commit_message>
feat(word-generator): Fully functional document generation with organized folder management
</commit_message>
<xml_diff>
--- a/src/main/resources/templates/demandtemplate.docx
+++ b/src/main/resources/templates/demandtemplate.docx
@@ -396,6 +396,7 @@
       <w:tr>
         <w:trPr>
           <w:trHeight w:val="226"/>
+          <w:tblHeader/>
           <w:jc w:val="center"/>
         </w:trPr>
         <w:tc>
@@ -588,8 +589,9 @@
           <w:iCs/>
           <w:u w:val="thick"/>
         </w:rPr>
-        <w:t>{{HIGHEST_NUM_MONTHS}}</w:t>
-      </w:r>
+        <w:t>{{HIGHEST_NUM_MONTHS</w:t>
+      </w:r>
+      <w:proofErr w:type="gramStart"/>
       <w:r>
         <w:rPr>
           <w:b/>
@@ -598,7 +600,28 @@
           <w:iCs/>
           <w:u w:val="thick"/>
         </w:rPr>
-        <w:t>mos. + 1,500 add fees)</w:t>
+        <w:t>}}</w:t>
+      </w:r>
+      <w:r>
+        <w:rPr>
+          <w:b/>
+          <w:bCs/>
+          <w:i/>
+          <w:iCs/>
+          <w:u w:val="thick"/>
+        </w:rPr>
+        <w:t>mos.</w:t>
+      </w:r>
+      <w:proofErr w:type="gramEnd"/>
+      <w:r>
+        <w:rPr>
+          <w:b/>
+          <w:bCs/>
+          <w:i/>
+          <w:iCs/>
+          <w:u w:val="thick"/>
+        </w:rPr>
+        <w:t xml:space="preserve"> + 1,500 add fees)</w:t>
       </w:r>
     </w:p>
     <w:p>

</xml_diff>

<commit_message>
chore: ignore input and generated files
</commit_message>
<xml_diff>
--- a/src/main/resources/templates/demandtemplate.docx
+++ b/src/main/resources/templates/demandtemplate.docx
@@ -340,17 +340,8 @@
           <w:b/>
           <w:bCs/>
         </w:rPr>
-        <w:t>(</w:t>
-      </w:r>
-      <w:proofErr w:type="spellStart"/>
-      <w:r>
-        <w:rPr>
-          <w:b/>
-          <w:bCs/>
-        </w:rPr>
-        <w:t>Php</w:t>
-      </w:r>
-      <w:proofErr w:type="spellEnd"/>
+        <w:t>(Php</w:t>
+      </w:r>
       <w:r>
         <w:rPr>
           <w:b/>
@@ -589,9 +580,8 @@
           <w:iCs/>
           <w:u w:val="thick"/>
         </w:rPr>
-        <w:t>{{HIGHEST_NUM_MONTHS</w:t>
-      </w:r>
-      <w:proofErr w:type="gramStart"/>
+        <w:t>{{HIGHEST_NUM_MONTHS}}</w:t>
+      </w:r>
       <w:r>
         <w:rPr>
           <w:b/>
@@ -600,7 +590,7 @@
           <w:iCs/>
           <w:u w:val="thick"/>
         </w:rPr>
-        <w:t>}}</w:t>
+        <w:t>mos</w:t>
       </w:r>
       <w:r>
         <w:rPr>
@@ -610,18 +600,7 @@
           <w:iCs/>
           <w:u w:val="thick"/>
         </w:rPr>
-        <w:t>mos.</w:t>
-      </w:r>
-      <w:proofErr w:type="gramEnd"/>
-      <w:r>
-        <w:rPr>
-          <w:b/>
-          <w:bCs/>
-          <w:i/>
-          <w:iCs/>
-          <w:u w:val="thick"/>
-        </w:rPr>
-        <w:t xml:space="preserve"> + 1,500 add fees)</w:t>
+        <w:t>. + 1,500 add fees)</w:t>
       </w:r>
     </w:p>
     <w:p>
@@ -651,7 +630,6 @@
         </w:rPr>
         <w:t xml:space="preserve">TOTAL = </w:t>
       </w:r>
-      <w:proofErr w:type="spellStart"/>
       <w:r>
         <w:rPr>
           <w:b/>
@@ -662,7 +640,6 @@
         </w:rPr>
         <w:t>Php</w:t>
       </w:r>
-      <w:proofErr w:type="spellEnd"/>
       <w:r>
         <w:rPr>
           <w:b/>

</xml_diff>

<commit_message>
feat: complete JavaFX demand letter generator desktop application
</commit_message>
<xml_diff>
--- a/src/main/resources/templates/demandtemplate.docx
+++ b/src/main/resources/templates/demandtemplate.docx
@@ -340,8 +340,17 @@
           <w:b/>
           <w:bCs/>
         </w:rPr>
-        <w:t>(Php</w:t>
-      </w:r>
+        <w:t>(</w:t>
+      </w:r>
+      <w:proofErr w:type="spellStart"/>
+      <w:r>
+        <w:rPr>
+          <w:b/>
+          <w:bCs/>
+        </w:rPr>
+        <w:t>Php</w:t>
+      </w:r>
+      <w:proofErr w:type="spellEnd"/>
       <w:r>
         <w:rPr>
           <w:b/>
@@ -494,6 +503,7 @@
     <w:p>
       <w:pPr>
         <w:pStyle w:val="Body"/>
+        <w:keepNext/>
         <w:tabs>
           <w:tab w:val="left" w:pos="3645"/>
         </w:tabs>
@@ -630,6 +640,7 @@
         </w:rPr>
         <w:t xml:space="preserve">TOTAL = </w:t>
       </w:r>
+      <w:proofErr w:type="spellStart"/>
       <w:r>
         <w:rPr>
           <w:b/>
@@ -640,6 +651,7 @@
         </w:rPr>
         <w:t>Php</w:t>
       </w:r>
+      <w:proofErr w:type="spellEnd"/>
       <w:r>
         <w:rPr>
           <w:b/>
@@ -654,6 +666,7 @@
     <w:p>
       <w:pPr>
         <w:pStyle w:val="Body"/>
+        <w:keepNext/>
         <w:tabs>
           <w:tab w:val="left" w:pos="3645"/>
         </w:tabs>
@@ -671,6 +684,25 @@
     <w:p>
       <w:pPr>
         <w:pStyle w:val="Body"/>
+        <w:keepNext/>
+        <w:tabs>
+          <w:tab w:val="left" w:pos="3645"/>
+        </w:tabs>
+        <w:spacing w:after="0" w:line="240" w:lineRule="auto"/>
+        <w:jc w:val="center"/>
+        <w:rPr>
+          <w:b/>
+          <w:bCs/>
+          <w:i/>
+          <w:iCs/>
+          <w:u w:val="thick"/>
+        </w:rPr>
+      </w:pPr>
+    </w:p>
+    <w:p>
+      <w:pPr>
+        <w:pStyle w:val="Body"/>
+        <w:keepNext/>
         <w:tabs>
           <w:tab w:val="left" w:pos="3645"/>
         </w:tabs>

</xml_diff>